<commit_message>
Fixed all docs without approve
</commit_message>
<xml_diff>
--- a/doc_diploma/Диплом_Новик/5_Содержание.docx
+++ b/doc_diploma/Диплом_Новик/5_Содержание.docx
@@ -3324,7 +3324,7 @@
                                               </pic:cNvPicPr>
                                             </pic:nvPicPr>
                                             <pic:blipFill>
-                                              <a:blip r:embed="rId8">
+                                              <a:blip r:embed="rId9">
                                                 <a:extLst>
                                                   <a:ext uri="{28A0092B-C50C-407E-A947-70E740481C1C}">
                                                     <a14:useLocalDpi xmlns:a14="http://schemas.microsoft.com/office/drawing/2010/main" val="0"/>
@@ -3958,7 +3958,7 @@
           <w:pPr>
             <w:keepNext/>
             <w:keepLines/>
-            <w:ind w:left="680"/>
+            <w:ind w:firstLine="680"/>
             <w:rPr>
               <w:sz w:val="28"/>
               <w:szCs w:val="28"/>
@@ -8509,17 +8509,64 @@
             <w:keepNext/>
             <w:keepLines/>
             <w:rPr>
-              <w:sz w:val="28"/>
-              <w:szCs w:val="28"/>
+              <w:rFonts w:ascii="Cambria" w:hAnsi="Cambria"/>
+              <w:color w:val="365F91"/>
+              <w:sz w:val="32"/>
+              <w:szCs w:val="32"/>
               <w:lang w:eastAsia="en-US"/>
             </w:rPr>
           </w:pPr>
         </w:p>
       </w:sdtContent>
     </w:sdt>
+    <w:p>
+      <w:pPr>
+        <w:rPr>
+          <w:rFonts w:ascii="Cambria" w:hAnsi="Cambria"/>
+          <w:color w:val="365F91"/>
+          <w:sz w:val="32"/>
+          <w:szCs w:val="32"/>
+          <w:lang w:eastAsia="en-US"/>
+        </w:rPr>
+      </w:pPr>
+      <w:r>
+        <w:rPr>
+          <w:rFonts w:ascii="Cambria" w:hAnsi="Cambria"/>
+          <w:color w:val="365F91"/>
+          <w:sz w:val="32"/>
+          <w:szCs w:val="32"/>
+          <w:lang w:eastAsia="en-US"/>
+        </w:rPr>
+        <w:br w:type="page"/>
+      </w:r>
+    </w:p>
+    <w:p>
+      <w:pPr>
+        <w:keepNext/>
+        <w:keepLines/>
+        <w:rPr>
+          <w:sz w:val="28"/>
+          <w:szCs w:val="28"/>
+          <w:lang w:eastAsia="en-US"/>
+        </w:rPr>
+      </w:pPr>
+      <w:r>
+        <w:rPr>
+          <w:sz w:val="28"/>
+          <w:szCs w:val="28"/>
+          <w:lang w:eastAsia="en-US"/>
+        </w:rPr>
+        <w:lastRenderedPageBreak/>
+        <w:t>в</w:t>
+      </w:r>
+    </w:p>
     <w:sectPr>
-      <w:headerReference w:type="even" r:id="rId9"/>
-      <w:headerReference w:type="default" r:id="rId10"/>
+      <w:headerReference w:type="even" r:id="rId10"/>
+      <w:headerReference w:type="default" r:id="rId11"/>
+      <w:footerReference w:type="even" r:id="rId12"/>
+      <w:footerReference w:type="default" r:id="rId13"/>
+      <w:headerReference w:type="first" r:id="rId14"/>
+      <w:footerReference w:type="first" r:id="rId15"/>
       <w:pgSz w:w="11906" w:h="16838"/>
       <w:pgMar w:top="1134" w:right="567" w:bottom="851" w:left="1247" w:header="720" w:footer="720" w:gutter="0"/>
       <w:pgNumType w:start="5"/>
@@ -8547,6 +8594,36 @@
     </w:p>
   </w:endnote>
 </w:endnotes>
+</file>
+
+<file path=word/footer1.xml><?xml version="1.0" encoding="utf-8"?>
+<w:ftr xmlns:wpc="http://schemas.microsoft.com/office/word/2010/wordprocessingCanvas" xmlns:cx="http://schemas.microsoft.com/office/drawing/2014/chartex" xmlns:cx1="http://schemas.microsoft.com/office/drawing/2015/9/8/chartex" xmlns:cx2="http://schemas.microsoft.com/office/drawing/2015/10/21/chartex" xmlns:cx3="http://schemas.microsoft.com/office/drawing/2016/5/9/chartex" xmlns:cx4="http://schemas.microsoft.com/office/drawing/2016/5/10/chartex" xmlns:cx5="http://schemas.microsoft.com/office/drawing/2016/5/11/chartex" xmlns:cx6="http://schemas.microsoft.com/office/drawing/2016/5/12/chartex" xmlns:cx7="http://schemas.microsoft.com/office/drawing/2016/5/13/chartex" xmlns:cx8="http://schemas.microsoft.com/office/drawing/2016/5/14/chartex" xmlns:mc="http://schemas.openxmlformats.org/markup-compatibility/2006" xmlns:aink="http://schemas.microsoft.com/office/drawing/2016/ink" xmlns:am3d="http://schemas.microsoft.com/office/drawing/2017/model3d" xmlns:o="urn:schemas-microsoft-com:office:office" xmlns:r="http://schemas.openxmlformats.org/officeDocument/2006/relationships" xmlns:m="http://schemas.openxmlformats.org/officeDocument/2006/math" xmlns:v="urn:schemas-microsoft-com:vml" xmlns:wp14="http://schemas.microsoft.com/office/word/2010/wordprocessingDrawing" xmlns:wp="http://schemas.openxmlformats.org/drawingml/2006/wordprocessingDrawing" xmlns:w10="urn:schemas-microsoft-com:office:word" xmlns:w="http://schemas.openxmlformats.org/wordprocessingml/2006/main" xmlns:w14="http://schemas.microsoft.com/office/word/2010/wordml" xmlns:w15="http://schemas.microsoft.com/office/word/2012/wordml" xmlns:w16cex="http://schemas.microsoft.com/office/word/2018/wordml/cex" xmlns:w16cid="http://schemas.microsoft.com/office/word/2016/wordml/cid" xmlns:w16="http://schemas.microsoft.com/office/word/2018/wordml" xmlns:w16sdtdh="http://schemas.microsoft.com/office/word/2020/wordml/sdtdatahash" xmlns:w16se="http://schemas.microsoft.com/office/word/2015/wordml/symex" xmlns:wpg="http://schemas.microsoft.com/office/word/2010/wordprocessingGroup" xmlns:wpi="http://schemas.microsoft.com/office/word/2010/wordprocessingInk" xmlns:wne="http://schemas.microsoft.com/office/word/2006/wordml" xmlns:wps="http://schemas.microsoft.com/office/word/2010/wordprocessingShape" mc:Ignorable="w14 w15 w16se w16cid w16 w16cex w16sdtdh wp14">
+  <w:p>
+    <w:pPr>
+      <w:pStyle w:val="a9"/>
+    </w:pPr>
+  </w:p>
+</w:ftr>
+</file>
+
+<file path=word/footer2.xml><?xml version="1.0" encoding="utf-8"?>
+<w:ftr xmlns:wpc="http://schemas.microsoft.com/office/word/2010/wordprocessingCanvas" xmlns:cx="http://schemas.microsoft.com/office/drawing/2014/chartex" xmlns:cx1="http://schemas.microsoft.com/office/drawing/2015/9/8/chartex" xmlns:cx2="http://schemas.microsoft.com/office/drawing/2015/10/21/chartex" xmlns:cx3="http://schemas.microsoft.com/office/drawing/2016/5/9/chartex" xmlns:cx4="http://schemas.microsoft.com/office/drawing/2016/5/10/chartex" xmlns:cx5="http://schemas.microsoft.com/office/drawing/2016/5/11/chartex" xmlns:cx6="http://schemas.microsoft.com/office/drawing/2016/5/12/chartex" xmlns:cx7="http://schemas.microsoft.com/office/drawing/2016/5/13/chartex" xmlns:cx8="http://schemas.microsoft.com/office/drawing/2016/5/14/chartex" xmlns:mc="http://schemas.openxmlformats.org/markup-compatibility/2006" xmlns:aink="http://schemas.microsoft.com/office/drawing/2016/ink" xmlns:am3d="http://schemas.microsoft.com/office/drawing/2017/model3d" xmlns:o="urn:schemas-microsoft-com:office:office" xmlns:r="http://schemas.openxmlformats.org/officeDocument/2006/relationships" xmlns:m="http://schemas.openxmlformats.org/officeDocument/2006/math" xmlns:v="urn:schemas-microsoft-com:vml" xmlns:wp14="http://schemas.microsoft.com/office/word/2010/wordprocessingDrawing" xmlns:wp="http://schemas.openxmlformats.org/drawingml/2006/wordprocessingDrawing" xmlns:w10="urn:schemas-microsoft-com:office:word" xmlns:w="http://schemas.openxmlformats.org/wordprocessingml/2006/main" xmlns:w14="http://schemas.microsoft.com/office/word/2010/wordml" xmlns:w15="http://schemas.microsoft.com/office/word/2012/wordml" xmlns:w16cex="http://schemas.microsoft.com/office/word/2018/wordml/cex" xmlns:w16cid="http://schemas.microsoft.com/office/word/2016/wordml/cid" xmlns:w16="http://schemas.microsoft.com/office/word/2018/wordml" xmlns:w16sdtdh="http://schemas.microsoft.com/office/word/2020/wordml/sdtdatahash" xmlns:w16se="http://schemas.microsoft.com/office/word/2015/wordml/symex" xmlns:wpg="http://schemas.microsoft.com/office/word/2010/wordprocessingGroup" xmlns:wpi="http://schemas.microsoft.com/office/word/2010/wordprocessingInk" xmlns:wne="http://schemas.microsoft.com/office/word/2006/wordml" xmlns:wps="http://schemas.microsoft.com/office/word/2010/wordprocessingShape" mc:Ignorable="w14 w15 w16se w16cid w16 w16cex w16sdtdh wp14">
+  <w:p>
+    <w:pPr>
+      <w:pStyle w:val="a9"/>
+    </w:pPr>
+  </w:p>
+</w:ftr>
+</file>
+
+<file path=word/footer3.xml><?xml version="1.0" encoding="utf-8"?>
+<w:ftr xmlns:wpc="http://schemas.microsoft.com/office/word/2010/wordprocessingCanvas" xmlns:cx="http://schemas.microsoft.com/office/drawing/2014/chartex" xmlns:cx1="http://schemas.microsoft.com/office/drawing/2015/9/8/chartex" xmlns:cx2="http://schemas.microsoft.com/office/drawing/2015/10/21/chartex" xmlns:cx3="http://schemas.microsoft.com/office/drawing/2016/5/9/chartex" xmlns:cx4="http://schemas.microsoft.com/office/drawing/2016/5/10/chartex" xmlns:cx5="http://schemas.microsoft.com/office/drawing/2016/5/11/chartex" xmlns:cx6="http://schemas.microsoft.com/office/drawing/2016/5/12/chartex" xmlns:cx7="http://schemas.microsoft.com/office/drawing/2016/5/13/chartex" xmlns:cx8="http://schemas.microsoft.com/office/drawing/2016/5/14/chartex" xmlns:mc="http://schemas.openxmlformats.org/markup-compatibility/2006" xmlns:aink="http://schemas.microsoft.com/office/drawing/2016/ink" xmlns:am3d="http://schemas.microsoft.com/office/drawing/2017/model3d" xmlns:o="urn:schemas-microsoft-com:office:office" xmlns:r="http://schemas.openxmlformats.org/officeDocument/2006/relationships" xmlns:m="http://schemas.openxmlformats.org/officeDocument/2006/math" xmlns:v="urn:schemas-microsoft-com:vml" xmlns:wp14="http://schemas.microsoft.com/office/word/2010/wordprocessingDrawing" xmlns:wp="http://schemas.openxmlformats.org/drawingml/2006/wordprocessingDrawing" xmlns:w10="urn:schemas-microsoft-com:office:word" xmlns:w="http://schemas.openxmlformats.org/wordprocessingml/2006/main" xmlns:w14="http://schemas.microsoft.com/office/word/2010/wordml" xmlns:w15="http://schemas.microsoft.com/office/word/2012/wordml" xmlns:w16cex="http://schemas.microsoft.com/office/word/2018/wordml/cex" xmlns:w16cid="http://schemas.microsoft.com/office/word/2016/wordml/cid" xmlns:w16="http://schemas.microsoft.com/office/word/2018/wordml" xmlns:w16sdtdh="http://schemas.microsoft.com/office/word/2020/wordml/sdtdatahash" xmlns:w16se="http://schemas.microsoft.com/office/word/2015/wordml/symex" xmlns:wpg="http://schemas.microsoft.com/office/word/2010/wordprocessingGroup" xmlns:wpi="http://schemas.microsoft.com/office/word/2010/wordprocessingInk" xmlns:wne="http://schemas.microsoft.com/office/word/2006/wordml" xmlns:wps="http://schemas.microsoft.com/office/word/2010/wordprocessingShape" mc:Ignorable="w14 w15 w16se w16cid w16 w16cex w16sdtdh wp14">
+  <w:p>
+    <w:pPr>
+      <w:pStyle w:val="a9"/>
+    </w:pPr>
+  </w:p>
+</w:ftr>
 </file>
 
 <file path=word/footnotes.xml><?xml version="1.0" encoding="utf-8"?>
@@ -8674,6 +8751,19 @@
     <w:pPr>
       <w:pStyle w:val="a5"/>
       <w:ind w:right="360"/>
+    </w:pPr>
+  </w:p>
+</w:hdr>
+</file>
+
+<file path=word/header3.xml><?xml version="1.0" encoding="utf-8"?>
+<w:hdr xmlns:wpc="http://schemas.microsoft.com/office/word/2010/wordprocessingCanvas" xmlns:cx="http://schemas.microsoft.com/office/drawing/2014/chartex" xmlns:cx1="http://schemas.microsoft.com/office/drawing/2015/9/8/chartex" xmlns:cx2="http://schemas.microsoft.com/office/drawing/2015/10/21/chartex" xmlns:cx3="http://schemas.microsoft.com/office/drawing/2016/5/9/chartex" xmlns:cx4="http://schemas.microsoft.com/office/drawing/2016/5/10/chartex" xmlns:cx5="http://schemas.microsoft.com/office/drawing/2016/5/11/chartex" xmlns:cx6="http://schemas.microsoft.com/office/drawing/2016/5/12/chartex" xmlns:cx7="http://schemas.microsoft.com/office/drawing/2016/5/13/chartex" xmlns:cx8="http://schemas.microsoft.com/office/drawing/2016/5/14/chartex" xmlns:mc="http://schemas.openxmlformats.org/markup-compatibility/2006" xmlns:aink="http://schemas.microsoft.com/office/drawing/2016/ink" xmlns:am3d="http://schemas.microsoft.com/office/drawing/2017/model3d" xmlns:o="urn:schemas-microsoft-com:office:office" xmlns:r="http://schemas.openxmlformats.org/officeDocument/2006/relationships" xmlns:m="http://schemas.openxmlformats.org/officeDocument/2006/math" xmlns:v="urn:schemas-microsoft-com:vml" xmlns:wp14="http://schemas.microsoft.com/office/word/2010/wordprocessingDrawing" xmlns:wp="http://schemas.openxmlformats.org/drawingml/2006/wordprocessingDrawing" xmlns:w10="urn:schemas-microsoft-com:office:word" xmlns:w="http://schemas.openxmlformats.org/wordprocessingml/2006/main" xmlns:w14="http://schemas.microsoft.com/office/word/2010/wordml" xmlns:w15="http://schemas.microsoft.com/office/word/2012/wordml" xmlns:w16cex="http://schemas.microsoft.com/office/word/2018/wordml/cex" xmlns:w16cid="http://schemas.microsoft.com/office/word/2016/wordml/cid" xmlns:w16="http://schemas.microsoft.com/office/word/2018/wordml" xmlns:w16sdtdh="http://schemas.microsoft.com/office/word/2020/wordml/sdtdatahash" xmlns:w16se="http://schemas.microsoft.com/office/word/2015/wordml/symex" xmlns:wpg="http://schemas.microsoft.com/office/word/2010/wordprocessingGroup" xmlns:wpi="http://schemas.microsoft.com/office/word/2010/wordprocessingInk" xmlns:wne="http://schemas.microsoft.com/office/word/2006/wordml" xmlns:wps="http://schemas.microsoft.com/office/word/2010/wordprocessingShape" mc:Ignorable="w14 w15 w16se w16cid w16 w16cex w16sdtdh wp14">
+  <w:p>
+    <w:pPr>
+      <w:pStyle w:val="a5"/>
+      <w:rPr>
+        <w:lang w:val="en-US"/>
+      </w:rPr>
     </w:pPr>
   </w:p>
 </w:hdr>

</xml_diff>